<commit_message>
docs(phase1): include deployment in project scope
</commit_message>
<xml_diff>
--- a/docs/phase1/Phase1_Initial_Plan_and_Requirements.docx
+++ b/docs/phase1/Phase1_Initial_Plan_and_Requirements.docx
@@ -195,7 +195,7 @@
     <w:sdt>
       <w:sdtPr>
         <w:alias w:val="Contents"/>
-        <w:id w:val="1191577261"/>
+        <w:id w:val="1902946045"/>
       </w:sdtPr>
       <w:sdtEndPr>
         <w:rPr>
@@ -231,7 +231,7 @@
           <w:r>
             <w:fldChar w:fldCharType="separate"/>
           </w:r>
-          <w:hyperlink w:anchor="_Toc240367790" w:history="1">
+          <w:hyperlink w:anchor="_Toc240370422" w:history="1">
             <w:r>
               <w:rPr>
                 <w:rStyle w:val="Hyperlink"/>
@@ -255,7 +255,7 @@
               <w:rPr>
                 <w:noProof/>
               </w:rPr>
-              <w:instrText xml:space="preserve"> PAGEREF _Toc240367790 \h </w:instrText>
+              <w:instrText xml:space="preserve"> PAGEREF _Toc240370422 \h </w:instrText>
             </w:r>
             <w:r>
               <w:rPr>
@@ -298,7 +298,7 @@
               <w14:ligatures w14:val="standardContextual"/>
             </w:rPr>
           </w:pPr>
-          <w:hyperlink w:anchor="_Toc240367791" w:history="1">
+          <w:hyperlink w:anchor="_Toc240370423" w:history="1">
             <w:r>
               <w:rPr>
                 <w:rStyle w:val="Hyperlink"/>
@@ -322,7 +322,7 @@
               <w:rPr>
                 <w:noProof/>
               </w:rPr>
-              <w:instrText xml:space="preserve"> PAGEREF _Toc240367791 \h </w:instrText>
+              <w:instrText xml:space="preserve"> PAGEREF _Toc240370423 \h </w:instrText>
             </w:r>
             <w:r>
               <w:rPr>
@@ -365,7 +365,7 @@
               <w14:ligatures w14:val="standardContextual"/>
             </w:rPr>
           </w:pPr>
-          <w:hyperlink w:anchor="_Toc240367792" w:history="1">
+          <w:hyperlink w:anchor="_Toc240370424" w:history="1">
             <w:r>
               <w:rPr>
                 <w:rStyle w:val="Hyperlink"/>
@@ -389,7 +389,7 @@
               <w:rPr>
                 <w:noProof/>
               </w:rPr>
-              <w:instrText xml:space="preserve"> PAGEREF _Toc240367792 \h </w:instrText>
+              <w:instrText xml:space="preserve"> PAGEREF _Toc240370424 \h </w:instrText>
             </w:r>
             <w:r>
               <w:rPr>
@@ -432,7 +432,7 @@
               <w14:ligatures w14:val="standardContextual"/>
             </w:rPr>
           </w:pPr>
-          <w:hyperlink w:anchor="_Toc240367793" w:history="1">
+          <w:hyperlink w:anchor="_Toc240370425" w:history="1">
             <w:r>
               <w:rPr>
                 <w:rStyle w:val="Hyperlink"/>
@@ -456,7 +456,7 @@
               <w:rPr>
                 <w:noProof/>
               </w:rPr>
-              <w:instrText xml:space="preserve"> PAGEREF _Toc240367793 \h </w:instrText>
+              <w:instrText xml:space="preserve"> PAGEREF _Toc240370425 \h </w:instrText>
             </w:r>
             <w:r>
               <w:rPr>
@@ -501,7 +501,7 @@
               <w14:ligatures w14:val="standardContextual"/>
             </w:rPr>
           </w:pPr>
-          <w:hyperlink w:anchor="_Toc240367794" w:history="1">
+          <w:hyperlink w:anchor="_Toc240370426" w:history="1">
             <w:r>
               <w:rPr>
                 <w:rStyle w:val="Hyperlink"/>
@@ -525,7 +525,7 @@
               <w:rPr>
                 <w:noProof/>
               </w:rPr>
-              <w:instrText xml:space="preserve"> PAGEREF _Toc240367794 \h </w:instrText>
+              <w:instrText xml:space="preserve"> PAGEREF _Toc240370426 \h </w:instrText>
             </w:r>
             <w:r>
               <w:rPr>
@@ -568,7 +568,7 @@
               <w14:ligatures w14:val="standardContextual"/>
             </w:rPr>
           </w:pPr>
-          <w:hyperlink w:anchor="_Toc240367795" w:history="1">
+          <w:hyperlink w:anchor="_Toc240370427" w:history="1">
             <w:r>
               <w:rPr>
                 <w:rStyle w:val="Hyperlink"/>
@@ -592,7 +592,7 @@
               <w:rPr>
                 <w:noProof/>
               </w:rPr>
-              <w:instrText xml:space="preserve"> PAGEREF _Toc240367795 \h </w:instrText>
+              <w:instrText xml:space="preserve"> PAGEREF _Toc240370427 \h </w:instrText>
             </w:r>
             <w:r>
               <w:rPr>
@@ -635,7 +635,7 @@
               <w14:ligatures w14:val="standardContextual"/>
             </w:rPr>
           </w:pPr>
-          <w:hyperlink w:anchor="_Toc240367796" w:history="1">
+          <w:hyperlink w:anchor="_Toc240370428" w:history="1">
             <w:r>
               <w:rPr>
                 <w:rStyle w:val="Hyperlink"/>
@@ -659,7 +659,7 @@
               <w:rPr>
                 <w:noProof/>
               </w:rPr>
-              <w:instrText xml:space="preserve"> PAGEREF _Toc240367796 \h </w:instrText>
+              <w:instrText xml:space="preserve"> PAGEREF _Toc240370428 \h </w:instrText>
             </w:r>
             <w:r>
               <w:rPr>
@@ -702,7 +702,7 @@
               <w14:ligatures w14:val="standardContextual"/>
             </w:rPr>
           </w:pPr>
-          <w:hyperlink w:anchor="_Toc240367797" w:history="1">
+          <w:hyperlink w:anchor="_Toc240370429" w:history="1">
             <w:r>
               <w:rPr>
                 <w:rStyle w:val="Hyperlink"/>
@@ -726,7 +726,7 @@
               <w:rPr>
                 <w:noProof/>
               </w:rPr>
-              <w:instrText xml:space="preserve"> PAGEREF _Toc240367797 \h </w:instrText>
+              <w:instrText xml:space="preserve"> PAGEREF _Toc240370429 \h </w:instrText>
             </w:r>
             <w:r>
               <w:rPr>
@@ -769,7 +769,7 @@
               <w14:ligatures w14:val="standardContextual"/>
             </w:rPr>
           </w:pPr>
-          <w:hyperlink w:anchor="_Toc240367798" w:history="1">
+          <w:hyperlink w:anchor="_Toc240370430" w:history="1">
             <w:r>
               <w:rPr>
                 <w:rStyle w:val="Hyperlink"/>
@@ -793,7 +793,7 @@
               <w:rPr>
                 <w:noProof/>
               </w:rPr>
-              <w:instrText xml:space="preserve"> PAGEREF _Toc240367798 \h </w:instrText>
+              <w:instrText xml:space="preserve"> PAGEREF _Toc240370430 \h </w:instrText>
             </w:r>
             <w:r>
               <w:rPr>
@@ -836,7 +836,7 @@
               <w14:ligatures w14:val="standardContextual"/>
             </w:rPr>
           </w:pPr>
-          <w:hyperlink w:anchor="_Toc240367799" w:history="1">
+          <w:hyperlink w:anchor="_Toc240370431" w:history="1">
             <w:r>
               <w:rPr>
                 <w:rStyle w:val="Hyperlink"/>
@@ -860,7 +860,7 @@
               <w:rPr>
                 <w:noProof/>
               </w:rPr>
-              <w:instrText xml:space="preserve"> PAGEREF _Toc240367799 \h </w:instrText>
+              <w:instrText xml:space="preserve"> PAGEREF _Toc240370431 \h </w:instrText>
             </w:r>
             <w:r>
               <w:rPr>
@@ -903,7 +903,7 @@
               <w14:ligatures w14:val="standardContextual"/>
             </w:rPr>
           </w:pPr>
-          <w:hyperlink w:anchor="_Toc240367800" w:history="1">
+          <w:hyperlink w:anchor="_Toc240370432" w:history="1">
             <w:r>
               <w:rPr>
                 <w:rStyle w:val="Hyperlink"/>
@@ -927,7 +927,7 @@
               <w:rPr>
                 <w:noProof/>
               </w:rPr>
-              <w:instrText xml:space="preserve"> PAGEREF _Toc240367800 \h </w:instrText>
+              <w:instrText xml:space="preserve"> PAGEREF _Toc240370432 \h </w:instrText>
             </w:r>
             <w:r>
               <w:rPr>
@@ -970,7 +970,7 @@
               <w14:ligatures w14:val="standardContextual"/>
             </w:rPr>
           </w:pPr>
-          <w:hyperlink w:anchor="_Toc240367801" w:history="1">
+          <w:hyperlink w:anchor="_Toc240370433" w:history="1">
             <w:r>
               <w:rPr>
                 <w:rStyle w:val="Hyperlink"/>
@@ -994,7 +994,7 @@
               <w:rPr>
                 <w:noProof/>
               </w:rPr>
-              <w:instrText xml:space="preserve"> PAGEREF _Toc240367801 \h </w:instrText>
+              <w:instrText xml:space="preserve"> PAGEREF _Toc240370433 \h </w:instrText>
             </w:r>
             <w:r>
               <w:rPr>
@@ -1037,7 +1037,7 @@
               <w14:ligatures w14:val="standardContextual"/>
             </w:rPr>
           </w:pPr>
-          <w:hyperlink w:anchor="_Toc240367802" w:history="1">
+          <w:hyperlink w:anchor="_Toc240370434" w:history="1">
             <w:r>
               <w:rPr>
                 <w:rStyle w:val="Hyperlink"/>
@@ -1061,7 +1061,7 @@
               <w:rPr>
                 <w:noProof/>
               </w:rPr>
-              <w:instrText xml:space="preserve"> PAGEREF _Toc240367802 \h </w:instrText>
+              <w:instrText xml:space="preserve"> PAGEREF _Toc240370434 \h </w:instrText>
             </w:r>
             <w:r>
               <w:rPr>
@@ -1106,7 +1106,7 @@
               <w14:ligatures w14:val="standardContextual"/>
             </w:rPr>
           </w:pPr>
-          <w:hyperlink w:anchor="_Toc240367803" w:history="1">
+          <w:hyperlink w:anchor="_Toc240370435" w:history="1">
             <w:r>
               <w:rPr>
                 <w:rStyle w:val="Hyperlink"/>
@@ -1130,7 +1130,7 @@
               <w:rPr>
                 <w:noProof/>
               </w:rPr>
-              <w:instrText xml:space="preserve"> PAGEREF _Toc240367803 \h </w:instrText>
+              <w:instrText xml:space="preserve"> PAGEREF _Toc240370435 \h </w:instrText>
             </w:r>
             <w:r>
               <w:rPr>
@@ -1173,7 +1173,7 @@
               <w14:ligatures w14:val="standardContextual"/>
             </w:rPr>
           </w:pPr>
-          <w:hyperlink w:anchor="_Toc240367804" w:history="1">
+          <w:hyperlink w:anchor="_Toc240370436" w:history="1">
             <w:r>
               <w:rPr>
                 <w:rStyle w:val="Hyperlink"/>
@@ -1197,7 +1197,7 @@
               <w:rPr>
                 <w:noProof/>
               </w:rPr>
-              <w:instrText xml:space="preserve"> PAGEREF _Toc240367804 \h </w:instrText>
+              <w:instrText xml:space="preserve"> PAGEREF _Toc240370436 \h </w:instrText>
             </w:r>
             <w:r>
               <w:rPr>
@@ -1240,7 +1240,7 @@
               <w14:ligatures w14:val="standardContextual"/>
             </w:rPr>
           </w:pPr>
-          <w:hyperlink w:anchor="_Toc240367805" w:history="1">
+          <w:hyperlink w:anchor="_Toc240370437" w:history="1">
             <w:r>
               <w:rPr>
                 <w:rStyle w:val="Hyperlink"/>
@@ -1264,7 +1264,7 @@
               <w:rPr>
                 <w:noProof/>
               </w:rPr>
-              <w:instrText xml:space="preserve"> PAGEREF _Toc240367805 \h </w:instrText>
+              <w:instrText xml:space="preserve"> PAGEREF _Toc240370437 \h </w:instrText>
             </w:r>
             <w:r>
               <w:rPr>
@@ -1307,7 +1307,7 @@
               <w14:ligatures w14:val="standardContextual"/>
             </w:rPr>
           </w:pPr>
-          <w:hyperlink w:anchor="_Toc240367806" w:history="1">
+          <w:hyperlink w:anchor="_Toc240370438" w:history="1">
             <w:r>
               <w:rPr>
                 <w:rStyle w:val="Hyperlink"/>
@@ -1331,7 +1331,7 @@
               <w:rPr>
                 <w:noProof/>
               </w:rPr>
-              <w:instrText xml:space="preserve"> PAGEREF _Toc240367806 \h </w:instrText>
+              <w:instrText xml:space="preserve"> PAGEREF _Toc240370438 \h </w:instrText>
             </w:r>
             <w:r>
               <w:rPr>
@@ -1374,7 +1374,7 @@
               <w14:ligatures w14:val="standardContextual"/>
             </w:rPr>
           </w:pPr>
-          <w:hyperlink w:anchor="_Toc240367807" w:history="1">
+          <w:hyperlink w:anchor="_Toc240370439" w:history="1">
             <w:r>
               <w:rPr>
                 <w:rStyle w:val="Hyperlink"/>
@@ -1398,7 +1398,7 @@
               <w:rPr>
                 <w:noProof/>
               </w:rPr>
-              <w:instrText xml:space="preserve"> PAGEREF _Toc240367807 \h </w:instrText>
+              <w:instrText xml:space="preserve"> PAGEREF _Toc240370439 \h </w:instrText>
             </w:r>
             <w:r>
               <w:rPr>
@@ -1443,7 +1443,7 @@
               <w14:ligatures w14:val="standardContextual"/>
             </w:rPr>
           </w:pPr>
-          <w:hyperlink w:anchor="_Toc240367808" w:history="1">
+          <w:hyperlink w:anchor="_Toc240370440" w:history="1">
             <w:r>
               <w:rPr>
                 <w:rStyle w:val="Hyperlink"/>
@@ -1467,7 +1467,7 @@
               <w:rPr>
                 <w:noProof/>
               </w:rPr>
-              <w:instrText xml:space="preserve"> PAGEREF _Toc240367808 \h </w:instrText>
+              <w:instrText xml:space="preserve"> PAGEREF _Toc240370440 \h </w:instrText>
             </w:r>
             <w:r>
               <w:rPr>
@@ -1512,7 +1512,7 @@
               <w14:ligatures w14:val="standardContextual"/>
             </w:rPr>
           </w:pPr>
-          <w:hyperlink w:anchor="_Toc240367809" w:history="1">
+          <w:hyperlink w:anchor="_Toc240370441" w:history="1">
             <w:r>
               <w:rPr>
                 <w:rStyle w:val="Hyperlink"/>
@@ -1536,7 +1536,7 @@
               <w:rPr>
                 <w:noProof/>
               </w:rPr>
-              <w:instrText xml:space="preserve"> PAGEREF _Toc240367809 \h </w:instrText>
+              <w:instrText xml:space="preserve"> PAGEREF _Toc240370441 \h </w:instrText>
             </w:r>
             <w:r>
               <w:rPr>
@@ -1579,7 +1579,7 @@
               <w14:ligatures w14:val="standardContextual"/>
             </w:rPr>
           </w:pPr>
-          <w:hyperlink w:anchor="_Toc240367810" w:history="1">
+          <w:hyperlink w:anchor="_Toc240370442" w:history="1">
             <w:r>
               <w:rPr>
                 <w:rStyle w:val="Hyperlink"/>
@@ -1603,7 +1603,7 @@
               <w:rPr>
                 <w:noProof/>
               </w:rPr>
-              <w:instrText xml:space="preserve"> PAGEREF _Toc240367810 \h </w:instrText>
+              <w:instrText xml:space="preserve"> PAGEREF _Toc240370442 \h </w:instrText>
             </w:r>
             <w:r>
               <w:rPr>
@@ -1646,7 +1646,7 @@
               <w14:ligatures w14:val="standardContextual"/>
             </w:rPr>
           </w:pPr>
-          <w:hyperlink w:anchor="_Toc240367811" w:history="1">
+          <w:hyperlink w:anchor="_Toc240370443" w:history="1">
             <w:r>
               <w:rPr>
                 <w:rStyle w:val="Hyperlink"/>
@@ -1670,7 +1670,7 @@
               <w:rPr>
                 <w:noProof/>
               </w:rPr>
-              <w:instrText xml:space="preserve"> PAGEREF _Toc240367811 \h </w:instrText>
+              <w:instrText xml:space="preserve"> PAGEREF _Toc240370443 \h </w:instrText>
             </w:r>
             <w:r>
               <w:rPr>
@@ -1713,7 +1713,7 @@
               <w14:ligatures w14:val="standardContextual"/>
             </w:rPr>
           </w:pPr>
-          <w:hyperlink w:anchor="_Toc240367812" w:history="1">
+          <w:hyperlink w:anchor="_Toc240370444" w:history="1">
             <w:r>
               <w:rPr>
                 <w:rStyle w:val="Hyperlink"/>
@@ -1737,7 +1737,7 @@
               <w:rPr>
                 <w:noProof/>
               </w:rPr>
-              <w:instrText xml:space="preserve"> PAGEREF _Toc240367812 \h </w:instrText>
+              <w:instrText xml:space="preserve"> PAGEREF _Toc240370444 \h </w:instrText>
             </w:r>
             <w:r>
               <w:rPr>
@@ -1782,7 +1782,7 @@
               <w14:ligatures w14:val="standardContextual"/>
             </w:rPr>
           </w:pPr>
-          <w:hyperlink w:anchor="_Toc240367813" w:history="1">
+          <w:hyperlink w:anchor="_Toc240370445" w:history="1">
             <w:r>
               <w:rPr>
                 <w:rStyle w:val="Hyperlink"/>
@@ -1806,7 +1806,7 @@
               <w:rPr>
                 <w:noProof/>
               </w:rPr>
-              <w:instrText xml:space="preserve"> PAGEREF _Toc240367813 \h </w:instrText>
+              <w:instrText xml:space="preserve"> PAGEREF _Toc240370445 \h </w:instrText>
             </w:r>
             <w:r>
               <w:rPr>
@@ -1849,7 +1849,7 @@
               <w14:ligatures w14:val="standardContextual"/>
             </w:rPr>
           </w:pPr>
-          <w:hyperlink w:anchor="_Toc240367814" w:history="1">
+          <w:hyperlink w:anchor="_Toc240370446" w:history="1">
             <w:r>
               <w:rPr>
                 <w:rStyle w:val="Hyperlink"/>
@@ -1873,7 +1873,7 @@
               <w:rPr>
                 <w:noProof/>
               </w:rPr>
-              <w:instrText xml:space="preserve"> PAGEREF _Toc240367814 \h </w:instrText>
+              <w:instrText xml:space="preserve"> PAGEREF _Toc240370446 \h </w:instrText>
             </w:r>
             <w:r>
               <w:rPr>
@@ -1916,7 +1916,7 @@
               <w14:ligatures w14:val="standardContextual"/>
             </w:rPr>
           </w:pPr>
-          <w:hyperlink w:anchor="_Toc240367815" w:history="1">
+          <w:hyperlink w:anchor="_Toc240370447" w:history="1">
             <w:r>
               <w:rPr>
                 <w:rStyle w:val="Hyperlink"/>
@@ -1940,7 +1940,7 @@
               <w:rPr>
                 <w:noProof/>
               </w:rPr>
-              <w:instrText xml:space="preserve"> PAGEREF _Toc240367815 \h </w:instrText>
+              <w:instrText xml:space="preserve"> PAGEREF _Toc240370447 \h </w:instrText>
             </w:r>
             <w:r>
               <w:rPr>
@@ -1983,7 +1983,7 @@
               <w14:ligatures w14:val="standardContextual"/>
             </w:rPr>
           </w:pPr>
-          <w:hyperlink w:anchor="_Toc240367816" w:history="1">
+          <w:hyperlink w:anchor="_Toc240370448" w:history="1">
             <w:r>
               <w:rPr>
                 <w:rStyle w:val="Hyperlink"/>
@@ -2007,7 +2007,7 @@
               <w:rPr>
                 <w:noProof/>
               </w:rPr>
-              <w:instrText xml:space="preserve"> PAGEREF _Toc240367816 \h </w:instrText>
+              <w:instrText xml:space="preserve"> PAGEREF _Toc240370448 \h </w:instrText>
             </w:r>
             <w:r>
               <w:rPr>
@@ -2050,7 +2050,7 @@
               <w14:ligatures w14:val="standardContextual"/>
             </w:rPr>
           </w:pPr>
-          <w:hyperlink w:anchor="_Toc240367817" w:history="1">
+          <w:hyperlink w:anchor="_Toc240370449" w:history="1">
             <w:r>
               <w:rPr>
                 <w:rStyle w:val="Hyperlink"/>
@@ -2074,7 +2074,7 @@
               <w:rPr>
                 <w:noProof/>
               </w:rPr>
-              <w:instrText xml:space="preserve"> PAGEREF _Toc240367817 \h </w:instrText>
+              <w:instrText xml:space="preserve"> PAGEREF _Toc240370449 \h </w:instrText>
             </w:r>
             <w:r>
               <w:rPr>
@@ -2119,7 +2119,7 @@
               <w14:ligatures w14:val="standardContextual"/>
             </w:rPr>
           </w:pPr>
-          <w:hyperlink w:anchor="_Toc240367818" w:history="1">
+          <w:hyperlink w:anchor="_Toc240370450" w:history="1">
             <w:r>
               <w:rPr>
                 <w:rStyle w:val="Hyperlink"/>
@@ -2143,7 +2143,7 @@
               <w:rPr>
                 <w:noProof/>
               </w:rPr>
-              <w:instrText xml:space="preserve"> PAGEREF _Toc240367818 \h </w:instrText>
+              <w:instrText xml:space="preserve"> PAGEREF _Toc240370450 \h </w:instrText>
             </w:r>
             <w:r>
               <w:rPr>
@@ -2160,7 +2160,7 @@
               <w:rPr>
                 <w:noProof/>
               </w:rPr>
-              <w:t>17</w:t>
+              <w:t>18</w:t>
             </w:r>
             <w:r>
               <w:rPr>
@@ -2188,7 +2188,7 @@
               <w14:ligatures w14:val="standardContextual"/>
             </w:rPr>
           </w:pPr>
-          <w:hyperlink w:anchor="_Toc240367819" w:history="1">
+          <w:hyperlink w:anchor="_Toc240370451" w:history="1">
             <w:r>
               <w:rPr>
                 <w:rStyle w:val="Hyperlink"/>
@@ -2212,7 +2212,7 @@
               <w:rPr>
                 <w:noProof/>
               </w:rPr>
-              <w:instrText xml:space="preserve"> PAGEREF _Toc240367819 \h </w:instrText>
+              <w:instrText xml:space="preserve"> PAGEREF _Toc240370451 \h </w:instrText>
             </w:r>
             <w:r>
               <w:rPr>
@@ -2255,7 +2255,7 @@
               <w14:ligatures w14:val="standardContextual"/>
             </w:rPr>
           </w:pPr>
-          <w:hyperlink w:anchor="_Toc240367820" w:history="1">
+          <w:hyperlink w:anchor="_Toc240370452" w:history="1">
             <w:r>
               <w:rPr>
                 <w:rStyle w:val="Hyperlink"/>
@@ -2279,7 +2279,7 @@
               <w:rPr>
                 <w:noProof/>
               </w:rPr>
-              <w:instrText xml:space="preserve"> PAGEREF _Toc240367820 \h </w:instrText>
+              <w:instrText xml:space="preserve"> PAGEREF _Toc240370452 \h </w:instrText>
             </w:r>
             <w:r>
               <w:rPr>
@@ -2322,7 +2322,7 @@
               <w14:ligatures w14:val="standardContextual"/>
             </w:rPr>
           </w:pPr>
-          <w:hyperlink w:anchor="_Toc240367821" w:history="1">
+          <w:hyperlink w:anchor="_Toc240370453" w:history="1">
             <w:r>
               <w:rPr>
                 <w:rStyle w:val="Hyperlink"/>
@@ -2346,7 +2346,7 @@
               <w:rPr>
                 <w:noProof/>
               </w:rPr>
-              <w:instrText xml:space="preserve"> PAGEREF _Toc240367821 \h </w:instrText>
+              <w:instrText xml:space="preserve"> PAGEREF _Toc240370453 \h </w:instrText>
             </w:r>
             <w:r>
               <w:rPr>
@@ -2363,7 +2363,7 @@
               <w:rPr>
                 <w:noProof/>
               </w:rPr>
-              <w:t>21</w:t>
+              <w:t>22</w:t>
             </w:r>
             <w:r>
               <w:rPr>
@@ -2389,7 +2389,7 @@
               <w14:ligatures w14:val="standardContextual"/>
             </w:rPr>
           </w:pPr>
-          <w:hyperlink w:anchor="_Toc240367822" w:history="1">
+          <w:hyperlink w:anchor="_Toc240370454" w:history="1">
             <w:r>
               <w:rPr>
                 <w:rStyle w:val="Hyperlink"/>
@@ -2413,7 +2413,7 @@
               <w:rPr>
                 <w:noProof/>
               </w:rPr>
-              <w:instrText xml:space="preserve"> PAGEREF _Toc240367822 \h </w:instrText>
+              <w:instrText xml:space="preserve"> PAGEREF _Toc240370454 \h </w:instrText>
             </w:r>
             <w:r>
               <w:rPr>
@@ -2430,7 +2430,7 @@
               <w:rPr>
                 <w:noProof/>
               </w:rPr>
-              <w:t>22</w:t>
+              <w:t>23</w:t>
             </w:r>
             <w:r>
               <w:rPr>
@@ -2456,7 +2456,7 @@
               <w14:ligatures w14:val="standardContextual"/>
             </w:rPr>
           </w:pPr>
-          <w:hyperlink w:anchor="_Toc240367823" w:history="1">
+          <w:hyperlink w:anchor="_Toc240370455" w:history="1">
             <w:r>
               <w:rPr>
                 <w:rStyle w:val="Hyperlink"/>
@@ -2480,7 +2480,7 @@
               <w:rPr>
                 <w:noProof/>
               </w:rPr>
-              <w:instrText xml:space="preserve"> PAGEREF _Toc240367823 \h </w:instrText>
+              <w:instrText xml:space="preserve"> PAGEREF _Toc240370455 \h </w:instrText>
             </w:r>
             <w:r>
               <w:rPr>
@@ -2523,7 +2523,7 @@
               <w14:ligatures w14:val="standardContextual"/>
             </w:rPr>
           </w:pPr>
-          <w:hyperlink w:anchor="_Toc240367824" w:history="1">
+          <w:hyperlink w:anchor="_Toc240370456" w:history="1">
             <w:r>
               <w:rPr>
                 <w:rStyle w:val="Hyperlink"/>
@@ -2547,7 +2547,7 @@
               <w:rPr>
                 <w:noProof/>
               </w:rPr>
-              <w:instrText xml:space="preserve"> PAGEREF _Toc240367824 \h </w:instrText>
+              <w:instrText xml:space="preserve"> PAGEREF _Toc240370456 \h </w:instrText>
             </w:r>
             <w:r>
               <w:rPr>
@@ -2564,7 +2564,7 @@
               <w:rPr>
                 <w:noProof/>
               </w:rPr>
-              <w:t>23</w:t>
+              <w:t>24</w:t>
             </w:r>
             <w:r>
               <w:rPr>
@@ -2590,7 +2590,7 @@
               <w14:ligatures w14:val="standardContextual"/>
             </w:rPr>
           </w:pPr>
-          <w:hyperlink w:anchor="_Toc240367825" w:history="1">
+          <w:hyperlink w:anchor="_Toc240370457" w:history="1">
             <w:r>
               <w:rPr>
                 <w:rStyle w:val="Hyperlink"/>
@@ -2614,7 +2614,7 @@
               <w:rPr>
                 <w:noProof/>
               </w:rPr>
-              <w:instrText xml:space="preserve"> PAGEREF _Toc240367825 \h </w:instrText>
+              <w:instrText xml:space="preserve"> PAGEREF _Toc240370457 \h </w:instrText>
             </w:r>
             <w:r>
               <w:rPr>
@@ -2631,7 +2631,7 @@
               <w:rPr>
                 <w:noProof/>
               </w:rPr>
-              <w:t>23</w:t>
+              <w:t>24</w:t>
             </w:r>
             <w:r>
               <w:rPr>
@@ -2657,7 +2657,7 @@
               <w14:ligatures w14:val="standardContextual"/>
             </w:rPr>
           </w:pPr>
-          <w:hyperlink w:anchor="_Toc240367826" w:history="1">
+          <w:hyperlink w:anchor="_Toc240370458" w:history="1">
             <w:r>
               <w:rPr>
                 <w:rStyle w:val="Hyperlink"/>
@@ -2681,7 +2681,7 @@
               <w:rPr>
                 <w:noProof/>
               </w:rPr>
-              <w:instrText xml:space="preserve"> PAGEREF _Toc240367826 \h </w:instrText>
+              <w:instrText xml:space="preserve"> PAGEREF _Toc240370458 \h </w:instrText>
             </w:r>
             <w:r>
               <w:rPr>
@@ -2724,7 +2724,7 @@
               <w14:ligatures w14:val="standardContextual"/>
             </w:rPr>
           </w:pPr>
-          <w:hyperlink w:anchor="_Toc240367827" w:history="1">
+          <w:hyperlink w:anchor="_Toc240370459" w:history="1">
             <w:r>
               <w:rPr>
                 <w:rStyle w:val="Hyperlink"/>
@@ -2748,7 +2748,7 @@
               <w:rPr>
                 <w:noProof/>
               </w:rPr>
-              <w:instrText xml:space="preserve"> PAGEREF _Toc240367827 \h </w:instrText>
+              <w:instrText xml:space="preserve"> PAGEREF _Toc240370459 \h </w:instrText>
             </w:r>
             <w:r>
               <w:rPr>
@@ -2765,7 +2765,7 @@
               <w:rPr>
                 <w:noProof/>
               </w:rPr>
-              <w:t>24</w:t>
+              <w:t>25</w:t>
             </w:r>
             <w:r>
               <w:rPr>
@@ -2791,7 +2791,7 @@
               <w14:ligatures w14:val="standardContextual"/>
             </w:rPr>
           </w:pPr>
-          <w:hyperlink w:anchor="_Toc240367828" w:history="1">
+          <w:hyperlink w:anchor="_Toc240370460" w:history="1">
             <w:r>
               <w:rPr>
                 <w:rStyle w:val="Hyperlink"/>
@@ -2815,7 +2815,7 @@
               <w:rPr>
                 <w:noProof/>
               </w:rPr>
-              <w:instrText xml:space="preserve"> PAGEREF _Toc240367828 \h </w:instrText>
+              <w:instrText xml:space="preserve"> PAGEREF _Toc240370460 \h </w:instrText>
             </w:r>
             <w:r>
               <w:rPr>
@@ -2860,7 +2860,7 @@
               <w14:ligatures w14:val="standardContextual"/>
             </w:rPr>
           </w:pPr>
-          <w:hyperlink w:anchor="_Toc240367829" w:history="1">
+          <w:hyperlink w:anchor="_Toc240370461" w:history="1">
             <w:r>
               <w:rPr>
                 <w:rStyle w:val="Hyperlink"/>
@@ -2884,7 +2884,7 @@
               <w:rPr>
                 <w:noProof/>
               </w:rPr>
-              <w:instrText xml:space="preserve"> PAGEREF _Toc240367829 \h </w:instrText>
+              <w:instrText xml:space="preserve"> PAGEREF _Toc240370461 \h </w:instrText>
             </w:r>
             <w:r>
               <w:rPr>
@@ -2929,7 +2929,7 @@
               <w14:ligatures w14:val="standardContextual"/>
             </w:rPr>
           </w:pPr>
-          <w:hyperlink w:anchor="_Toc240367830" w:history="1">
+          <w:hyperlink w:anchor="_Toc240370462" w:history="1">
             <w:r>
               <w:rPr>
                 <w:rStyle w:val="Hyperlink"/>
@@ -2953,7 +2953,7 @@
               <w:rPr>
                 <w:noProof/>
               </w:rPr>
-              <w:instrText xml:space="preserve"> PAGEREF _Toc240367830 \h </w:instrText>
+              <w:instrText xml:space="preserve"> PAGEREF _Toc240370462 \h </w:instrText>
             </w:r>
             <w:r>
               <w:rPr>
@@ -2998,7 +2998,7 @@
               <w14:ligatures w14:val="standardContextual"/>
             </w:rPr>
           </w:pPr>
-          <w:hyperlink w:anchor="_Toc240367831" w:history="1">
+          <w:hyperlink w:anchor="_Toc240370463" w:history="1">
             <w:r>
               <w:rPr>
                 <w:rStyle w:val="Hyperlink"/>
@@ -3022,7 +3022,7 @@
               <w:rPr>
                 <w:noProof/>
               </w:rPr>
-              <w:instrText xml:space="preserve"> PAGEREF _Toc240367831 \h </w:instrText>
+              <w:instrText xml:space="preserve"> PAGEREF _Toc240370463 \h </w:instrText>
             </w:r>
             <w:r>
               <w:rPr>
@@ -3061,7 +3061,7 @@
         <w:pStyle w:val="Heading1"/>
         <w:pageBreakBefore/>
       </w:pPr>
-      <w:bookmarkStart w:id="0" w:name="_Toc240367790"/>
+      <w:bookmarkStart w:id="0" w:name="_Toc240370422"/>
       <w:r>
         <w:lastRenderedPageBreak/>
         <w:t>1 Introduction</w:t>
@@ -3072,7 +3072,7 @@
       <w:pPr>
         <w:pStyle w:val="Heading2"/>
       </w:pPr>
-      <w:bookmarkStart w:id="1" w:name="_Toc240367791"/>
+      <w:bookmarkStart w:id="1" w:name="_Toc240370423"/>
       <w:r>
         <w:t>1.1 Project Concept</w:t>
       </w:r>
@@ -3095,7 +3095,7 @@
       <w:pPr>
         <w:pStyle w:val="Heading2"/>
       </w:pPr>
-      <w:bookmarkStart w:id="2" w:name="_Toc240367792"/>
+      <w:bookmarkStart w:id="2" w:name="_Toc240370424"/>
       <w:r>
         <w:t>1.2 Problem Statement</w:t>
       </w:r>
@@ -3117,7 +3117,7 @@
       <w:pPr>
         <w:pStyle w:val="Heading2"/>
       </w:pPr>
-      <w:bookmarkStart w:id="3" w:name="_Toc240367793"/>
+      <w:bookmarkStart w:id="3" w:name="_Toc240370425"/>
       <w:r>
         <w:t>1.3 Document Purpose</w:t>
       </w:r>
@@ -3215,7 +3215,7 @@
       <w:pPr>
         <w:pStyle w:val="Heading1"/>
       </w:pPr>
-      <w:bookmarkStart w:id="4" w:name="_Toc240367794"/>
+      <w:bookmarkStart w:id="4" w:name="_Toc240370426"/>
       <w:r>
         <w:t>2 Project Overview</w:t>
       </w:r>
@@ -3225,7 +3225,7 @@
       <w:pPr>
         <w:pStyle w:val="Heading2"/>
       </w:pPr>
-      <w:bookmarkStart w:id="5" w:name="_Toc240367795"/>
+      <w:bookmarkStart w:id="5" w:name="_Toc240370427"/>
       <w:r>
         <w:t>2.1 High Level Description of the Proposed System</w:t>
       </w:r>
@@ -3292,7 +3292,7 @@
       <w:pPr>
         <w:pStyle w:val="Heading2"/>
       </w:pPr>
-      <w:bookmarkStart w:id="6" w:name="_Toc240367796"/>
+      <w:bookmarkStart w:id="6" w:name="_Toc240370428"/>
       <w:r>
         <w:t>2.2 Background and Context</w:t>
       </w:r>
@@ -3315,7 +3315,7 @@
       <w:pPr>
         <w:pStyle w:val="Heading2"/>
       </w:pPr>
-      <w:bookmarkStart w:id="7" w:name="_Toc240367797"/>
+      <w:bookmarkStart w:id="7" w:name="_Toc240370429"/>
       <w:r>
         <w:t>2.3 Business Goals and Objectives</w:t>
       </w:r>
@@ -4060,7 +4060,7 @@
       <w:pPr>
         <w:pStyle w:val="Heading2"/>
       </w:pPr>
-      <w:bookmarkStart w:id="8" w:name="_Toc240367798"/>
+      <w:bookmarkStart w:id="8" w:name="_Toc240370430"/>
       <w:r>
         <w:t>2.4 Project Constraints</w:t>
       </w:r>
@@ -4518,7 +4518,7 @@
                 <w:sz w:val="20"/>
                 <w:szCs w:val="20"/>
               </w:rPr>
-              <w:t>Web application; must run on a grader's machine from the repository with documented setup. AI features depend on external LLM/embedding APIs with rate limits.</w:t>
+              <w:t>Web application with documented local setup and deployment to a hosting environment. The hosting platform will be selected in Phase 2. AI features depend on external LLM/embedding APIs with rate limits.</w:t>
             </w:r>
           </w:p>
         </w:tc>
@@ -4594,7 +4594,7 @@
       <w:pPr>
         <w:pStyle w:val="Heading2"/>
       </w:pPr>
-      <w:bookmarkStart w:id="9" w:name="_Toc240367799"/>
+      <w:bookmarkStart w:id="9" w:name="_Toc240370431"/>
       <w:r>
         <w:t>2.5 Scope of the Project</w:t>
       </w:r>
@@ -4761,6 +4761,19 @@
         <w:spacing w:after="75"/>
       </w:pPr>
       <w:r>
+        <w:t>Hosting and deployment of the web application for access by intended users and reviewers, with documented configuration, deployment, and restart procedures.</w:t>
+      </w:r>
+    </w:p>
+    <w:p>
+      <w:pPr>
+        <w:pStyle w:val="ListParagraph"/>
+        <w:numPr>
+          <w:ilvl w:val="0"/>
+          <w:numId w:val="2"/>
+        </w:numPr>
+        <w:spacing w:after="75"/>
+      </w:pPr>
+      <w:r>
         <w:t>Full documentation across all eight phases and a working prototype with demonstration.</w:t>
       </w:r>
     </w:p>
@@ -4821,6 +4834,7 @@
         <w:spacing w:after="75"/>
       </w:pPr>
       <w:r>
+        <w:lastRenderedPageBreak/>
         <w:t>Training custom machine-learning models from scratch; the project uses pre-trained models and hosted LLM/embedding services.</w:t>
       </w:r>
     </w:p>
@@ -4839,23 +4853,9 @@
     </w:p>
     <w:p>
       <w:pPr>
-        <w:pStyle w:val="ListParagraph"/>
-        <w:numPr>
-          <w:ilvl w:val="0"/>
-          <w:numId w:val="2"/>
-        </w:numPr>
-        <w:spacing w:after="75"/>
-      </w:pPr>
-      <w:r>
-        <w:lastRenderedPageBreak/>
-        <w:t>Production deployment, high-availability hosting and formal security certification.</w:t>
-      </w:r>
-    </w:p>
-    <w:p>
-      <w:pPr>
         <w:pStyle w:val="Heading2"/>
       </w:pPr>
-      <w:bookmarkStart w:id="10" w:name="_Toc240367800"/>
+      <w:bookmarkStart w:id="10" w:name="_Toc240370432"/>
       <w:r>
         <w:t>2.6 Assumptions</w:t>
       </w:r>
@@ -4930,7 +4930,7 @@
       <w:pPr>
         <w:pStyle w:val="Heading2"/>
       </w:pPr>
-      <w:bookmarkStart w:id="11" w:name="_Toc240367801"/>
+      <w:bookmarkStart w:id="11" w:name="_Toc240370433"/>
       <w:r>
         <w:t>2.7 Key Terms</w:t>
       </w:r>
@@ -5707,7 +5707,7 @@
       <w:pPr>
         <w:pStyle w:val="Heading2"/>
       </w:pPr>
-      <w:bookmarkStart w:id="12" w:name="_Toc240367802"/>
+      <w:bookmarkStart w:id="12" w:name="_Toc240370434"/>
       <w:r>
         <w:t>2.8 Expected Benefits</w:t>
       </w:r>
@@ -5895,6 +5895,7 @@
                 <w:sz w:val="20"/>
                 <w:szCs w:val="20"/>
               </w:rPr>
+              <w:lastRenderedPageBreak/>
               <w:t>University finance</w:t>
             </w:r>
           </w:p>
@@ -5956,7 +5957,6 @@
                 <w:sz w:val="20"/>
                 <w:szCs w:val="20"/>
               </w:rPr>
-              <w:lastRenderedPageBreak/>
               <w:t>Sustainability office</w:t>
             </w:r>
           </w:p>
@@ -6180,7 +6180,7 @@
       <w:pPr>
         <w:pStyle w:val="Heading1"/>
       </w:pPr>
-      <w:bookmarkStart w:id="13" w:name="_Toc240367803"/>
+      <w:bookmarkStart w:id="13" w:name="_Toc240370435"/>
       <w:r>
         <w:t>3 Stakeholder Analysis</w:t>
       </w:r>
@@ -6190,7 +6190,7 @@
       <w:pPr>
         <w:pStyle w:val="Heading2"/>
       </w:pPr>
-      <w:bookmarkStart w:id="14" w:name="_Toc240367804"/>
+      <w:bookmarkStart w:id="14" w:name="_Toc240370436"/>
       <w:r>
         <w:t>3.1 Identification of Stakeholders</w:t>
       </w:r>
@@ -6932,7 +6932,7 @@
       <w:pPr>
         <w:pStyle w:val="Heading2"/>
       </w:pPr>
-      <w:bookmarkStart w:id="15" w:name="_Toc240367805"/>
+      <w:bookmarkStart w:id="15" w:name="_Toc240370437"/>
       <w:r>
         <w:t>3.2 Stakeholder Roles and Responsibilities</w:t>
       </w:r>
@@ -7179,6 +7179,7 @@
                 <w:sz w:val="20"/>
                 <w:szCs w:val="20"/>
               </w:rPr>
+              <w:lastRenderedPageBreak/>
               <w:t>Asset custodian</w:t>
             </w:r>
           </w:p>
@@ -7265,7 +7266,6 @@
                 <w:sz w:val="20"/>
                 <w:szCs w:val="20"/>
               </w:rPr>
-              <w:lastRenderedPageBreak/>
               <w:t>Requester</w:t>
             </w:r>
           </w:p>
@@ -8019,7 +8019,7 @@
       <w:pPr>
         <w:pStyle w:val="Heading2"/>
       </w:pPr>
-      <w:bookmarkStart w:id="16" w:name="_Toc240367806"/>
+      <w:bookmarkStart w:id="16" w:name="_Toc240370438"/>
       <w:r>
         <w:t>3.3 Stakeholder Needs and Expectations</w:t>
       </w:r>
@@ -8949,6 +8949,7 @@
                 <w:sz w:val="20"/>
                 <w:szCs w:val="20"/>
               </w:rPr>
+              <w:lastRenderedPageBreak/>
               <w:t>Lab instructors</w:t>
             </w:r>
           </w:p>
@@ -9035,7 +9036,6 @@
                 <w:sz w:val="20"/>
                 <w:szCs w:val="20"/>
               </w:rPr>
-              <w:lastRenderedPageBreak/>
               <w:t>Student project team</w:t>
             </w:r>
           </w:p>
@@ -9101,7 +9101,7 @@
       <w:pPr>
         <w:pStyle w:val="Heading2"/>
       </w:pPr>
-      <w:bookmarkStart w:id="17" w:name="_Toc240367807"/>
+      <w:bookmarkStart w:id="17" w:name="_Toc240370439"/>
       <w:r>
         <w:t>3.4 Stakeholder to Feature Mapping</w:t>
       </w:r>
@@ -10936,7 +10936,7 @@
       <w:pPr>
         <w:pStyle w:val="Heading1"/>
       </w:pPr>
-      <w:bookmarkStart w:id="18" w:name="_Toc240367808"/>
+      <w:bookmarkStart w:id="18" w:name="_Toc240370440"/>
       <w:r>
         <w:t>4 Study of the Current As Is Process</w:t>
       </w:r>
@@ -11611,7 +11611,7 @@
       <w:pPr>
         <w:pStyle w:val="Heading1"/>
       </w:pPr>
-      <w:bookmarkStart w:id="19" w:name="_Toc240367809"/>
+      <w:bookmarkStart w:id="19" w:name="_Toc240370441"/>
       <w:r>
         <w:t>5 Requirements Gathering</w:t>
       </w:r>
@@ -11621,7 +11621,7 @@
       <w:pPr>
         <w:pStyle w:val="Heading2"/>
       </w:pPr>
-      <w:bookmarkStart w:id="20" w:name="_Toc240367810"/>
+      <w:bookmarkStart w:id="20" w:name="_Toc240370442"/>
       <w:r>
         <w:t>5.1 Methodology</w:t>
       </w:r>
@@ -12573,7 +12573,7 @@
       <w:pPr>
         <w:pStyle w:val="Heading2"/>
       </w:pPr>
-      <w:bookmarkStart w:id="21" w:name="_Toc240367811"/>
+      <w:bookmarkStart w:id="21" w:name="_Toc240370443"/>
       <w:r>
         <w:t>5.2 Summary of Gathered Requirements</w:t>
       </w:r>
@@ -12708,7 +12708,7 @@
       <w:pPr>
         <w:pStyle w:val="Heading2"/>
       </w:pPr>
-      <w:bookmarkStart w:id="22" w:name="_Toc240367812"/>
+      <w:bookmarkStart w:id="22" w:name="_Toc240370444"/>
       <w:r>
         <w:t>5.3 Prioritisation of Requirements</w:t>
       </w:r>
@@ -12955,6 +12955,7 @@
                 <w:sz w:val="20"/>
                 <w:szCs w:val="20"/>
               </w:rPr>
+              <w:lastRenderedPageBreak/>
               <w:t>Should have</w:t>
             </w:r>
           </w:p>
@@ -13005,7 +13006,7 @@
                 <w:sz w:val="20"/>
                 <w:szCs w:val="20"/>
               </w:rPr>
-              <w:t>Optional demo hosting; sustainable-action recommendations; LLM assistant; configurable approval limits; further tuning of the required matching factors; richer sustainability dashboard; report export; improved accessibility and exception handling.</w:t>
+              <w:t>Application hosting and deployment; sustainable-action recommendations; LLM assistant; configurable approval limits; further tuning of the required matching factors; richer sustainability dashboard; report export; improved accessibility and exception handling.</w:t>
             </w:r>
           </w:p>
         </w:tc>
@@ -13041,7 +13042,6 @@
                 <w:sz w:val="20"/>
                 <w:szCs w:val="20"/>
               </w:rPr>
-              <w:lastRenderedPageBreak/>
               <w:t>Could have</w:t>
             </w:r>
           </w:p>
@@ -13198,7 +13198,7 @@
       <w:pPr>
         <w:pStyle w:val="Heading1"/>
       </w:pPr>
-      <w:bookmarkStart w:id="23" w:name="_Toc240367813"/>
+      <w:bookmarkStart w:id="23" w:name="_Toc240370445"/>
       <w:r>
         <w:t>6 Initial Requirements Specification</w:t>
       </w:r>
@@ -13226,7 +13226,7 @@
       <w:pPr>
         <w:pStyle w:val="Heading2"/>
       </w:pPr>
-      <w:bookmarkStart w:id="24" w:name="_Toc240367814"/>
+      <w:bookmarkStart w:id="24" w:name="_Toc240370446"/>
       <w:r>
         <w:t>6.1 Functional Requirements Classic Baseline</w:t>
       </w:r>
@@ -13649,6 +13649,7 @@
                 <w:sz w:val="20"/>
                 <w:szCs w:val="20"/>
               </w:rPr>
+              <w:lastRenderedPageBreak/>
               <w:t>FR-04</w:t>
             </w:r>
           </w:p>
@@ -13825,7 +13826,6 @@
                 <w:sz w:val="20"/>
                 <w:szCs w:val="20"/>
               </w:rPr>
-              <w:lastRenderedPageBreak/>
               <w:t>FR-06</w:t>
             </w:r>
           </w:p>
@@ -14794,6 +14794,7 @@
                 <w:sz w:val="20"/>
                 <w:szCs w:val="20"/>
               </w:rPr>
+              <w:lastRenderedPageBreak/>
               <w:t>FR-17</w:t>
             </w:r>
           </w:p>
@@ -14948,9 +14949,8 @@
       <w:pPr>
         <w:pStyle w:val="Heading2"/>
       </w:pPr>
-      <w:bookmarkStart w:id="25" w:name="_Toc240367815"/>
+      <w:bookmarkStart w:id="25" w:name="_Toc240370447"/>
       <w:r>
-        <w:lastRenderedPageBreak/>
         <w:t>6.2 Functional Requirements AI Enhanced Extension</w:t>
       </w:r>
       <w:bookmarkEnd w:id="25"/>
@@ -15993,6 +15993,7 @@
                 <w:sz w:val="20"/>
                 <w:szCs w:val="20"/>
               </w:rPr>
+              <w:lastRenderedPageBreak/>
               <w:t>AI-11</w:t>
             </w:r>
           </w:p>
@@ -16169,7 +16170,6 @@
                 <w:sz w:val="20"/>
                 <w:szCs w:val="20"/>
               </w:rPr>
-              <w:lastRenderedPageBreak/>
               <w:t>AI-13</w:t>
             </w:r>
           </w:p>
@@ -16236,7 +16236,7 @@
       <w:pPr>
         <w:pStyle w:val="Heading2"/>
       </w:pPr>
-      <w:bookmarkStart w:id="26" w:name="_Toc240367816"/>
+      <w:bookmarkStart w:id="26" w:name="_Toc240370448"/>
       <w:r>
         <w:t>6.3 Sustainability Measurement Requirements</w:t>
       </w:r>
@@ -17082,7 +17082,7 @@
       <w:pPr>
         <w:pStyle w:val="Heading2"/>
       </w:pPr>
-      <w:bookmarkStart w:id="27" w:name="_Toc240367817"/>
+      <w:bookmarkStart w:id="27" w:name="_Toc240370449"/>
       <w:r>
         <w:t>6.4 Non Functional Requirements</w:t>
       </w:r>
@@ -17090,7 +17090,11 @@
     </w:p>
     <w:p>
       <w:r>
-        <w:t>The numerical targets below are preliminary engineering targets for a semester prototype. The initial test dataset will contain 500 synthetic assets across 10 departments and 50 requests. Performance tests will use five concurrent users and a documented machine, browser, software version, and network setup so results can be repeated. The targets will be reviewed during Phase 3.</w:t>
+        <w:t xml:space="preserve">The numerical targets below are preliminary engineering targets for a semester prototype. The initial test dataset will contain 500 synthetic assets across 10 departments and 50 requests. Performance tests will use </w:t>
+      </w:r>
+      <w:r>
+        <w:lastRenderedPageBreak/>
+        <w:t>five concurrent users and a documented machine, browser, software version, and network setup so results can be repeated. The targets will be reviewed during Phase 3.</w:t>
       </w:r>
     </w:p>
     <w:tbl>
@@ -17388,7 +17392,6 @@
                 <w:sz w:val="20"/>
                 <w:szCs w:val="20"/>
               </w:rPr>
-              <w:lastRenderedPageBreak/>
               <w:t>NFR-02</w:t>
             </w:r>
           </w:p>
@@ -18600,6 +18603,120 @@
           </w:p>
         </w:tc>
       </w:tr>
+      <w:tr>
+        <w:tblPrEx>
+          <w:tblCellMar>
+            <w:top w:w="0" w:type="dxa"/>
+            <w:bottom w:w="0" w:type="dxa"/>
+          </w:tblCellMar>
+        </w:tblPrEx>
+        <w:trPr>
+          <w:cantSplit/>
+        </w:trPr>
+        <w:tc>
+          <w:tcPr>
+            <w:tcW w:w="1041" w:type="dxa"/>
+            <w:shd w:val="clear" w:color="auto" w:fill="FFFFFF"/>
+            <w:tcMar>
+              <w:top w:w="80" w:type="dxa"/>
+              <w:left w:w="100" w:type="dxa"/>
+              <w:bottom w:w="80" w:type="dxa"/>
+              <w:right w:w="100" w:type="dxa"/>
+            </w:tcMar>
+            <w:vAlign w:val="center"/>
+          </w:tcPr>
+          <w:p>
+            <w:pPr>
+              <w:spacing w:after="0" w:line="235" w:lineRule="auto"/>
+              <w:jc w:val="center"/>
+            </w:pPr>
+            <w:r>
+              <w:rPr>
+                <w:sz w:val="20"/>
+                <w:szCs w:val="20"/>
+              </w:rPr>
+              <w:lastRenderedPageBreak/>
+              <w:t>NFR-13</w:t>
+            </w:r>
+          </w:p>
+        </w:tc>
+        <w:tc>
+          <w:tcPr>
+            <w:tcW w:w="1666" w:type="dxa"/>
+            <w:shd w:val="clear" w:color="auto" w:fill="FFFFFF"/>
+            <w:tcMar>
+              <w:top w:w="80" w:type="dxa"/>
+              <w:left w:w="100" w:type="dxa"/>
+              <w:bottom w:w="80" w:type="dxa"/>
+              <w:right w:w="100" w:type="dxa"/>
+            </w:tcMar>
+            <w:vAlign w:val="center"/>
+          </w:tcPr>
+          <w:p>
+            <w:pPr>
+              <w:spacing w:after="0" w:line="235" w:lineRule="auto"/>
+            </w:pPr>
+            <w:r>
+              <w:rPr>
+                <w:sz w:val="20"/>
+                <w:szCs w:val="20"/>
+              </w:rPr>
+              <w:t>Deployment</w:t>
+            </w:r>
+          </w:p>
+        </w:tc>
+        <w:tc>
+          <w:tcPr>
+            <w:tcW w:w="6414" w:type="dxa"/>
+            <w:shd w:val="clear" w:color="auto" w:fill="FFFFFF"/>
+            <w:tcMar>
+              <w:top w:w="80" w:type="dxa"/>
+              <w:left w:w="100" w:type="dxa"/>
+              <w:bottom w:w="80" w:type="dxa"/>
+              <w:right w:w="100" w:type="dxa"/>
+            </w:tcMar>
+            <w:vAlign w:val="center"/>
+          </w:tcPr>
+          <w:p>
+            <w:pPr>
+              <w:spacing w:after="0" w:line="235" w:lineRule="auto"/>
+            </w:pPr>
+            <w:r>
+              <w:rPr>
+                <w:sz w:val="20"/>
+                <w:szCs w:val="20"/>
+              </w:rPr>
+              <w:t>The system shall be deployed to the hosting environment selected during Phase 2 and made accessible to intended users and reviewers through a documented HTTPS URL. Deployment instructions shall cover configuration, secret management, database setup, application startup, and restart. The hosted application shall preserve role-based access controls and classic fallback when AI is unavailable.</w:t>
+            </w:r>
+          </w:p>
+        </w:tc>
+        <w:tc>
+          <w:tcPr>
+            <w:tcW w:w="625" w:type="dxa"/>
+            <w:shd w:val="clear" w:color="auto" w:fill="FFFFFF"/>
+            <w:tcMar>
+              <w:top w:w="80" w:type="dxa"/>
+              <w:left w:w="100" w:type="dxa"/>
+              <w:bottom w:w="80" w:type="dxa"/>
+              <w:right w:w="100" w:type="dxa"/>
+            </w:tcMar>
+            <w:vAlign w:val="center"/>
+          </w:tcPr>
+          <w:p>
+            <w:pPr>
+              <w:spacing w:after="0" w:line="235" w:lineRule="auto"/>
+              <w:jc w:val="center"/>
+            </w:pPr>
+            <w:r>
+              <w:rPr>
+                <w:sz w:val="20"/>
+                <w:szCs w:val="20"/>
+              </w:rPr>
+              <w:t>S</w:t>
+            </w:r>
+          </w:p>
+        </w:tc>
+      </w:tr>
     </w:tbl>
     <w:p>
       <w:pPr>
@@ -18610,7 +18727,7 @@
       <w:pPr>
         <w:pStyle w:val="Heading1"/>
       </w:pPr>
-      <w:bookmarkStart w:id="28" w:name="_Toc240367818"/>
+      <w:bookmarkStart w:id="28" w:name="_Toc240370450"/>
       <w:r>
         <w:t>7 Measurable Project Success Criteria</w:t>
       </w:r>
@@ -18623,11 +18740,7 @@
     </w:p>
     <w:p>
       <w:r>
-        <w:t xml:space="preserve">Testing will use synthetic data containing 500 assets across 10 departments and 50 requests, including a fixed evaluation set of 20 requests for which suitable assets exist. Before evaluating matching quality, two </w:t>
-      </w:r>
-      <w:r>
-        <w:lastRenderedPageBreak/>
-        <w:t>team members will independently label suitable assets using a shared checklist covering purpose, specifications, quantity, condition, location, and required date, then resolve disagreements. Classic search and AI matching will use the same requests and asset snapshot.</w:t>
+        <w:t>Testing will use synthetic data containing 500 assets across 10 departments and 50 requests, including a fixed evaluation set of 20 requests for which suitable assets exist. Before evaluating matching quality, two team members will independently label suitable assets using a shared checklist covering purpose, specifications, quantity, condition, location, and required date, then resolve disagreements. Classic search and AI matching will use the same requests and asset snapshot.</w:t>
       </w:r>
     </w:p>
     <w:p>
@@ -19258,6 +19371,7 @@
                 <w:sz w:val="20"/>
                 <w:szCs w:val="20"/>
               </w:rPr>
+              <w:lastRenderedPageBreak/>
               <w:t>Match usefulness</w:t>
             </w:r>
           </w:p>
@@ -19480,7 +19594,6 @@
                 <w:sz w:val="20"/>
                 <w:szCs w:val="20"/>
               </w:rPr>
-              <w:lastRenderedPageBreak/>
               <w:t>AI classification and assistant</w:t>
             </w:r>
           </w:p>
@@ -20036,6 +20149,7 @@
                 <w:sz w:val="20"/>
                 <w:szCs w:val="20"/>
               </w:rPr>
+              <w:lastRenderedPageBreak/>
               <w:t>Responsible AI</w:t>
             </w:r>
           </w:p>
@@ -20147,7 +20261,6 @@
                 <w:sz w:val="20"/>
                 <w:szCs w:val="20"/>
               </w:rPr>
-              <w:lastRenderedPageBreak/>
               <w:t>Responsible AI</w:t>
             </w:r>
           </w:p>
@@ -20703,7 +20816,8 @@
                 <w:sz w:val="20"/>
                 <w:szCs w:val="20"/>
               </w:rPr>
-              <w:t>Scalability</w:t>
+              <w:lastRenderedPageBreak/>
+              <w:t>Deployment</w:t>
             </w:r>
           </w:p>
         </w:tc>
@@ -20728,7 +20842,7 @@
                 <w:sz w:val="20"/>
                 <w:szCs w:val="20"/>
               </w:rPr>
-              <w:t>The Should-have growth target is evaluated (NFR-11).</w:t>
+              <w:t>The application is hosted and accessible to intended users and reviewers (NFR-13).</w:t>
             </w:r>
           </w:p>
         </w:tc>
@@ -20753,7 +20867,7 @@
                 <w:sz w:val="20"/>
                 <w:szCs w:val="20"/>
               </w:rPr>
-              <w:t>At least 95 of 100 classic searches finish within 3 seconds with 2,000 assets, 200 requests, and five concurrent users.</w:t>
+              <w:t>Before the final demonstration, one teammate completes a fresh deployment using the documented steps; the hosted registration, search, request, and approval workflows pass, including an AI-unavailable fallback check.</w:t>
             </w:r>
           </w:p>
         </w:tc>
@@ -20778,7 +20892,7 @@
                 <w:sz w:val="20"/>
                 <w:szCs w:val="20"/>
               </w:rPr>
-              <w:t>Repeat the documented search test with the larger dataset; report this result separately from Must-have acceptance.</w:t>
+              <w:t>Record the deployed version, hosting configuration, HTTPS URL, deployment and restart steps, role-access checks, and workflow results.</w:t>
             </w:r>
           </w:p>
         </w:tc>
@@ -20814,7 +20928,7 @@
                 <w:sz w:val="20"/>
                 <w:szCs w:val="20"/>
               </w:rPr>
-              <w:t>Process</w:t>
+              <w:t>Scalability</w:t>
             </w:r>
           </w:p>
         </w:tc>
@@ -20839,7 +20953,7 @@
                 <w:sz w:val="20"/>
                 <w:szCs w:val="20"/>
               </w:rPr>
-              <w:t>Each member contributes regularly through their own GitHub account.</w:t>
+              <w:t>The Should-have growth target is evaluated (NFR-11).</w:t>
             </w:r>
           </w:p>
         </w:tc>
@@ -20864,7 +20978,7 @@
                 <w:sz w:val="20"/>
                 <w:szCs w:val="20"/>
               </w:rPr>
-              <w:t>Proposed team target: at least 2 meaningful commits per member per active project week; for Phase 1, at least 1 meaningful commit for each of the member's 3 assigned sections.</w:t>
+              <w:t>At least 95 of 100 classic searches finish within 3 seconds with 2,000 assets, 200 requests, and five concurrent users.</w:t>
             </w:r>
           </w:p>
         </w:tc>
@@ -20889,7 +21003,7 @@
                 <w:sz w:val="20"/>
                 <w:szCs w:val="20"/>
               </w:rPr>
-              <w:t>Review authors, dates, changed content, and messages weekly. Empty, cosmetic, or artificially split commits do not count toward the team target.</w:t>
+              <w:t>Repeat the documented search test with the larger dataset; report this result separately from Must-have acceptance.</w:t>
             </w:r>
           </w:p>
         </w:tc>
@@ -20925,7 +21039,117 @@
                 <w:sz w:val="20"/>
                 <w:szCs w:val="20"/>
               </w:rPr>
-              <w:lastRenderedPageBreak/>
+              <w:t>Process</w:t>
+            </w:r>
+          </w:p>
+        </w:tc>
+        <w:tc>
+          <w:tcPr>
+            <w:tcW w:w="3124" w:type="dxa"/>
+            <w:shd w:val="clear" w:color="auto" w:fill="F2F4F5"/>
+            <w:tcMar>
+              <w:top w:w="80" w:type="dxa"/>
+              <w:left w:w="100" w:type="dxa"/>
+              <w:bottom w:w="80" w:type="dxa"/>
+              <w:right w:w="100" w:type="dxa"/>
+            </w:tcMar>
+            <w:vAlign w:val="center"/>
+          </w:tcPr>
+          <w:p>
+            <w:pPr>
+              <w:spacing w:after="0" w:line="235" w:lineRule="auto"/>
+            </w:pPr>
+            <w:r>
+              <w:rPr>
+                <w:sz w:val="20"/>
+                <w:szCs w:val="20"/>
+              </w:rPr>
+              <w:t>Each member contributes regularly through their own GitHub account.</w:t>
+            </w:r>
+          </w:p>
+        </w:tc>
+        <w:tc>
+          <w:tcPr>
+            <w:tcW w:w="2291" w:type="dxa"/>
+            <w:shd w:val="clear" w:color="auto" w:fill="F2F4F5"/>
+            <w:tcMar>
+              <w:top w:w="80" w:type="dxa"/>
+              <w:left w:w="100" w:type="dxa"/>
+              <w:bottom w:w="80" w:type="dxa"/>
+              <w:right w:w="100" w:type="dxa"/>
+            </w:tcMar>
+            <w:vAlign w:val="center"/>
+          </w:tcPr>
+          <w:p>
+            <w:pPr>
+              <w:spacing w:after="0" w:line="235" w:lineRule="auto"/>
+            </w:pPr>
+            <w:r>
+              <w:rPr>
+                <w:sz w:val="20"/>
+                <w:szCs w:val="20"/>
+              </w:rPr>
+              <w:t>Proposed team target: at least 2 meaningful commits per member per active project week; for Phase 1, at least 1 meaningful commit for each of the member's 3 assigned sections.</w:t>
+            </w:r>
+          </w:p>
+        </w:tc>
+        <w:tc>
+          <w:tcPr>
+            <w:tcW w:w="2353" w:type="dxa"/>
+            <w:shd w:val="clear" w:color="auto" w:fill="F2F4F5"/>
+            <w:tcMar>
+              <w:top w:w="80" w:type="dxa"/>
+              <w:left w:w="100" w:type="dxa"/>
+              <w:bottom w:w="80" w:type="dxa"/>
+              <w:right w:w="100" w:type="dxa"/>
+            </w:tcMar>
+            <w:vAlign w:val="center"/>
+          </w:tcPr>
+          <w:p>
+            <w:pPr>
+              <w:spacing w:after="0" w:line="235" w:lineRule="auto"/>
+            </w:pPr>
+            <w:r>
+              <w:rPr>
+                <w:sz w:val="20"/>
+                <w:szCs w:val="20"/>
+              </w:rPr>
+              <w:t>Review authors, dates, changed content, and messages weekly. Empty, cosmetic, or artificially split commits do not count toward the team target.</w:t>
+            </w:r>
+          </w:p>
+        </w:tc>
+      </w:tr>
+      <w:tr>
+        <w:tblPrEx>
+          <w:tblCellMar>
+            <w:top w:w="0" w:type="dxa"/>
+            <w:bottom w:w="0" w:type="dxa"/>
+          </w:tblCellMar>
+        </w:tblPrEx>
+        <w:trPr>
+          <w:cantSplit/>
+        </w:trPr>
+        <w:tc>
+          <w:tcPr>
+            <w:tcW w:w="1978" w:type="dxa"/>
+            <w:shd w:val="clear" w:color="auto" w:fill="FFFFFF"/>
+            <w:tcMar>
+              <w:top w:w="80" w:type="dxa"/>
+              <w:left w:w="100" w:type="dxa"/>
+              <w:bottom w:w="80" w:type="dxa"/>
+              <w:right w:w="100" w:type="dxa"/>
+            </w:tcMar>
+            <w:vAlign w:val="center"/>
+          </w:tcPr>
+          <w:p>
+            <w:pPr>
+              <w:spacing w:after="0" w:line="235" w:lineRule="auto"/>
+            </w:pPr>
+            <w:r>
+              <w:rPr>
+                <w:sz w:val="20"/>
+                <w:szCs w:val="20"/>
+              </w:rPr>
               <w:t>Documentation</w:t>
             </w:r>
           </w:p>
@@ -20933,7 +21157,7 @@
         <w:tc>
           <w:tcPr>
             <w:tcW w:w="3124" w:type="dxa"/>
-            <w:shd w:val="clear" w:color="auto" w:fill="F2F4F5"/>
+            <w:shd w:val="clear" w:color="auto" w:fill="FFFFFF"/>
             <w:tcMar>
               <w:top w:w="80" w:type="dxa"/>
               <w:left w:w="100" w:type="dxa"/>
@@ -20958,7 +21182,7 @@
         <w:tc>
           <w:tcPr>
             <w:tcW w:w="2291" w:type="dxa"/>
-            <w:shd w:val="clear" w:color="auto" w:fill="F2F4F5"/>
+            <w:shd w:val="clear" w:color="auto" w:fill="FFFFFF"/>
             <w:tcMar>
               <w:top w:w="80" w:type="dxa"/>
               <w:left w:w="100" w:type="dxa"/>
@@ -20983,7 +21207,7 @@
         <w:tc>
           <w:tcPr>
             <w:tcW w:w="2353" w:type="dxa"/>
-            <w:shd w:val="clear" w:color="auto" w:fill="F2F4F5"/>
+            <w:shd w:val="clear" w:color="auto" w:fill="FFFFFF"/>
             <w:tcMar>
               <w:top w:w="80" w:type="dxa"/>
               <w:left w:w="100" w:type="dxa"/>
@@ -21021,7 +21245,7 @@
       <w:pPr>
         <w:pStyle w:val="Heading1"/>
       </w:pPr>
-      <w:bookmarkStart w:id="29" w:name="_Toc240367819"/>
+      <w:bookmarkStart w:id="29" w:name="_Toc240370451"/>
       <w:r>
         <w:t>8 Initial Project Plan</w:t>
       </w:r>
@@ -21031,7 +21255,7 @@
       <w:pPr>
         <w:pStyle w:val="Heading2"/>
       </w:pPr>
-      <w:bookmarkStart w:id="30" w:name="_Toc240367820"/>
+      <w:bookmarkStart w:id="30" w:name="_Toc240370452"/>
       <w:r>
         <w:t>8.1 Proposed Methodology</w:t>
       </w:r>
@@ -21049,8 +21273,9 @@
       <w:pPr>
         <w:pStyle w:val="Heading2"/>
       </w:pPr>
-      <w:bookmarkStart w:id="31" w:name="_Toc240367821"/>
+      <w:bookmarkStart w:id="31" w:name="_Toc240370453"/>
       <w:r>
+        <w:lastRenderedPageBreak/>
         <w:t>8.2 Preliminary Timeline and Milestones</w:t>
       </w:r>
       <w:bookmarkEnd w:id="31"/>
@@ -21505,7 +21730,7 @@
                 <w:sz w:val="20"/>
                 <w:szCs w:val="20"/>
               </w:rPr>
-              <w:t>Technical, financial, operational, schedule, data/AI and legal/ethical feasibility; technology stack decision; LLM/embedding API selection and fallback.</w:t>
+              <w:t>Technical, financial, operational, schedule, data/AI and legal/ethical feasibility; technology stack and hosting selection; LLM/embedding API selection and fallback.</w:t>
             </w:r>
           </w:p>
         </w:tc>
@@ -21919,7 +22144,7 @@
                 <w:sz w:val="20"/>
                 <w:szCs w:val="20"/>
               </w:rPr>
-              <w:t>Working prototype: auth/RBAC, departments, assets, marketplace, requests, search, AI classification and matching, approvals, transfers, maintenance, sustainability dashboard, reports.</w:t>
+              <w:t>Working prototype: auth/RBAC, departments, assets, marketplace, requests, search, AI classification and matching, approvals, transfers, maintenance, sustainability dashboard, reports; initial hosted deployment.</w:t>
             </w:r>
           </w:p>
         </w:tc>
@@ -21956,7 +22181,6 @@
                 <w:sz w:val="20"/>
                 <w:szCs w:val="20"/>
               </w:rPr>
-              <w:lastRenderedPageBreak/>
               <w:t>7</w:t>
             </w:r>
           </w:p>
@@ -22196,7 +22420,7 @@
                 <w:sz w:val="20"/>
                 <w:szCs w:val="20"/>
               </w:rPr>
-              <w:t>Final code, configuration, documentation across all phases, presentation and live demo.</w:t>
+              <w:t>Final code, hosted application URL, configuration and deployment instructions, documentation across all phases, presentation and live demo.</w:t>
             </w:r>
           </w:p>
         </w:tc>
@@ -22509,7 +22733,7 @@
                 <w:sz w:val="20"/>
                 <w:szCs w:val="20"/>
               </w:rPr>
-              <w:t>Feasibility study; choose technology stack; test one LLM/embedding API end-to-end.</w:t>
+              <w:t>Feasibility study; choose technology stack and hosting; test one LLM/embedding API end-to-end.</w:t>
             </w:r>
           </w:p>
         </w:tc>
@@ -22893,6 +23117,7 @@
                 <w:sz w:val="20"/>
                 <w:szCs w:val="20"/>
               </w:rPr>
+              <w:lastRenderedPageBreak/>
               <w:t>26 Oct</w:t>
             </w:r>
           </w:p>
@@ -23205,7 +23430,7 @@
                 <w:sz w:val="20"/>
                 <w:szCs w:val="20"/>
               </w:rPr>
-              <w:t>Maintenance, sustainability dashboard, reports; submit draft implementation.</w:t>
+              <w:t>Maintenance, sustainability dashboard, reports; deploy the draft application and verify hosted workflows.</w:t>
             </w:r>
           </w:p>
         </w:tc>
@@ -23292,7 +23517,7 @@
                 <w:sz w:val="20"/>
                 <w:szCs w:val="20"/>
               </w:rPr>
-              <w:t>Test cases, bug fixes, final documentation, presentation and demo.</w:t>
+              <w:t>Test cases, bug fixes, final deployment and restart checks, documentation, presentation and demo.</w:t>
             </w:r>
           </w:p>
         </w:tc>
@@ -23307,7 +23532,7 @@
       <w:pPr>
         <w:pStyle w:val="Heading2"/>
       </w:pPr>
-      <w:bookmarkStart w:id="32" w:name="_Toc240367822"/>
+      <w:bookmarkStart w:id="32" w:name="_Toc240370454"/>
       <w:r>
         <w:t>8.3 Team Structure and Roles</w:t>
       </w:r>
@@ -23809,7 +24034,7 @@
       <w:pPr>
         <w:pStyle w:val="Heading2"/>
       </w:pPr>
-      <w:bookmarkStart w:id="33" w:name="_Toc240367823"/>
+      <w:bookmarkStart w:id="33" w:name="_Toc240370455"/>
       <w:r>
         <w:t>8.4 Task Assignments for Phases 1 to 3</w:t>
       </w:r>
@@ -24223,7 +24448,7 @@
                 <w:sz w:val="20"/>
                 <w:szCs w:val="20"/>
               </w:rPr>
-              <w:t>Technology stack proposal and AI API evaluation (free tiers, rate limits, fallback)</w:t>
+              <w:t>Technology stack, hosting proposal and AI API evaluation (free tiers, rate limits, fallback)</w:t>
             </w:r>
           </w:p>
         </w:tc>
@@ -24653,6 +24878,7 @@
                 <w:sz w:val="20"/>
                 <w:szCs w:val="20"/>
               </w:rPr>
+              <w:lastRenderedPageBreak/>
               <w:t>Synthetic data set design (assets, departments, requests)</w:t>
             </w:r>
           </w:p>
@@ -24718,7 +24944,7 @@
       <w:pPr>
         <w:pStyle w:val="Heading2"/>
       </w:pPr>
-      <w:bookmarkStart w:id="34" w:name="_Toc240367824"/>
+      <w:bookmarkStart w:id="34" w:name="_Toc240370456"/>
       <w:r>
         <w:t>8.5 Dependencies</w:t>
       </w:r>
@@ -24773,7 +24999,7 @@
         <w:spacing w:after="75"/>
       </w:pPr>
       <w:r>
-        <w:t>Phase 6 implementation depends on the synthetic data set and on all members having a working local environment.</w:t>
+        <w:t>Phase 6 implementation and deployment depend on the synthetic data set, working local environments, selected hosting, deployment credentials, and documented application/database configuration.</w:t>
       </w:r>
     </w:p>
     <w:p>
@@ -24806,7 +25032,7 @@
       <w:pPr>
         <w:pStyle w:val="Heading2"/>
       </w:pPr>
-      <w:bookmarkStart w:id="35" w:name="_Toc240367825"/>
+      <w:bookmarkStart w:id="35" w:name="_Toc240370457"/>
       <w:r>
         <w:t>8.6 Risks and Mitigation</w:t>
       </w:r>
@@ -25441,7 +25667,6 @@
                 <w:sz w:val="20"/>
                 <w:szCs w:val="20"/>
               </w:rPr>
-              <w:lastRenderedPageBreak/>
               <w:t>R4</w:t>
             </w:r>
           </w:p>
@@ -26254,7 +26479,7 @@
       <w:pPr>
         <w:pStyle w:val="Heading2"/>
       </w:pPr>
-      <w:bookmarkStart w:id="36" w:name="_Toc240367826"/>
+      <w:bookmarkStart w:id="36" w:name="_Toc240370458"/>
       <w:r>
         <w:t>8.7 Resource Allocation</w:t>
       </w:r>
@@ -26294,6 +26519,7 @@
           <w:b/>
           <w:bCs/>
         </w:rPr>
+        <w:lastRenderedPageBreak/>
         <w:t>Tools:</w:t>
       </w:r>
       <w:r>
@@ -26317,7 +26543,7 @@
         <w:t>Infrastructure:</w:t>
       </w:r>
       <w:r>
-        <w:t xml:space="preserve"> local development machines; university lab computers; optional free-tier cloud hosting for the demo.</w:t>
+        <w:t xml:space="preserve"> local development machines; university lab computers; application and database hosting on a suitable free or university-provided tier selected in Phase 2. Ghith leads deployment, with Sultan supporting configuration and integration.</w:t>
       </w:r>
     </w:p>
     <w:p>
@@ -26364,7 +26590,7 @@
       <w:pPr>
         <w:pStyle w:val="Heading2"/>
       </w:pPr>
-      <w:bookmarkStart w:id="37" w:name="_Toc240367827"/>
+      <w:bookmarkStart w:id="37" w:name="_Toc240370459"/>
       <w:r>
         <w:t>8.8 Communication Plan</w:t>
       </w:r>
@@ -26929,9 +27155,8 @@
       <w:pPr>
         <w:pStyle w:val="Heading2"/>
       </w:pPr>
-      <w:bookmarkStart w:id="38" w:name="_Toc240367828"/>
+      <w:bookmarkStart w:id="38" w:name="_Toc240370460"/>
       <w:r>
-        <w:lastRenderedPageBreak/>
         <w:t>8.9 Version Control and Collaboration Workflow</w:t>
       </w:r>
       <w:bookmarkEnd w:id="38"/>
@@ -27018,7 +27243,7 @@
       <w:pPr>
         <w:pStyle w:val="Heading1"/>
       </w:pPr>
-      <w:bookmarkStart w:id="39" w:name="_Toc240367829"/>
+      <w:bookmarkStart w:id="39" w:name="_Toc240370461"/>
       <w:r>
         <w:t>9 Classic and AI Enhanced Perspective Initial Reflection</w:t>
       </w:r>
@@ -27091,6 +27316,7 @@
                 <w:sz w:val="20"/>
                 <w:szCs w:val="20"/>
               </w:rPr>
+              <w:lastRenderedPageBreak/>
               <w:t>Aspect</w:t>
             </w:r>
           </w:p>
@@ -27544,7 +27770,6 @@
                 <w:sz w:val="20"/>
                 <w:szCs w:val="20"/>
               </w:rPr>
-              <w:lastRenderedPageBreak/>
               <w:t>Life-cycle decisions</w:t>
             </w:r>
           </w:p>
@@ -27858,17 +28083,16 @@
         <w:t xml:space="preserve">Human control remains mandatory for asset transfers, donation, recycling, disposal, repair spending, changes to financial values, and assignment of user roles. Releasing and receiving departments approve transfers; procurement, finance, and sustainability roles review the relevant policy, spending, and environmental decisions as agreed with the client. A business administrator authorises role assignments, and technical administrators apply them without gaining automatic business approval rights. Users must </w:t>
       </w:r>
       <w:r>
+        <w:lastRenderedPageBreak/>
         <w:t>explicitly confirm assistant-proposed changes, and consequential actions must still pass their normal approval workflow. AI may recommend and explain, but it must not provide the final approval or bypass a required human decision.</w:t>
       </w:r>
     </w:p>
     <w:p>
       <w:pPr>
         <w:pStyle w:val="Heading1"/>
-        <w:pageBreakBefore/>
       </w:pPr>
-      <w:bookmarkStart w:id="40" w:name="_Toc240367830"/>
+      <w:bookmarkStart w:id="40" w:name="_Toc240370462"/>
       <w:r>
-        <w:lastRenderedPageBreak/>
         <w:t>10 Open Questions for the Client</w:t>
       </w:r>
       <w:bookmarkEnd w:id="40"/>
@@ -27942,7 +28166,7 @@
       <w:pPr>
         <w:pStyle w:val="Heading1"/>
       </w:pPr>
-      <w:bookmarkStart w:id="41" w:name="_Toc240367831"/>
+      <w:bookmarkStart w:id="41" w:name="_Toc240370463"/>
       <w:r>
         <w:t>11 References</w:t>
       </w:r>
@@ -28138,10 +28362,10 @@
 <file path=word/numbering.xml><?xml version="1.0" encoding="utf-8"?>
 <w:numbering xmlns:wpc="http://schemas.microsoft.com/office/word/2010/wordprocessingCanvas" xmlns:cx="http://schemas.microsoft.com/office/drawing/2014/chartex" xmlns:cx1="http://schemas.microsoft.com/office/drawing/2015/9/8/chartex" xmlns:cx2="http://schemas.microsoft.com/office/drawing/2015/10/21/chartex" xmlns:cx3="http://schemas.microsoft.com/office/drawing/2016/5/9/chartex" xmlns:cx4="http://schemas.microsoft.com/office/drawing/2016/5/10/chartex" xmlns:cx5="http://schemas.microsoft.com/office/drawing/2016/5/11/chartex" xmlns:cx6="http://schemas.microsoft.com/office/drawing/2016/5/12/chartex" xmlns:cx7="http://schemas.microsoft.com/office/drawing/2016/5/13/chartex" xmlns:cx8="http://schemas.microsoft.com/office/drawing/2016/5/14/chartex" xmlns:mc="http://schemas.openxmlformats.org/markup-compatibility/2006" xmlns:aink="http://schemas.microsoft.com/office/drawing/2016/ink" xmlns:am3d="http://schemas.microsoft.com/office/drawing/2017/model3d" xmlns:o="urn:schemas-microsoft-com:office:office" xmlns:oel="http://schemas.microsoft.com/office/2019/extlst" xmlns:r="http://schemas.openxmlformats.org/officeDocument/2006/relationships" xmlns:m="http://schemas.openxmlformats.org/officeDocument/2006/math" xmlns:v="urn:schemas-microsoft-com:vml" xmlns:wp14="http://schemas.microsoft.com/office/word/2010/wordprocessingDrawing" xmlns:wp="http://schemas.openxmlformats.org/drawingml/2006/wordprocessingDrawing" xmlns:w10="urn:schemas-microsoft-com:office:word" xmlns:w="http://schemas.openxmlformats.org/wordprocessingml/2006/main" xmlns:w14="http://schemas.microsoft.com/office/word/2010/wordml" xmlns:w15="http://schemas.microsoft.com/office/word/2012/wordml" xmlns:w16cex="http://schemas.microsoft.com/office/word/2018/wordml/cex" xmlns:w16cid="http://schemas.microsoft.com/office/word/2016/wordml/cid" xmlns:w16="http://schemas.microsoft.com/office/word/2018/wordml" xmlns:w16du="http://schemas.microsoft.com/office/word/2023/wordml/word16du" xmlns:w16sdtdh="http://schemas.microsoft.com/office/word/2020/wordml/sdtdatahash" xmlns:w16sdtfl="http://schemas.microsoft.com/office/word/2024/wordml/sdtformatlock" xmlns:w16se="http://schemas.microsoft.com/office/word/2015/wordml/symex" xmlns:wpg="http://schemas.microsoft.com/office/word/2010/wordprocessingGroup" xmlns:wpi="http://schemas.microsoft.com/office/word/2010/wordprocessingInk" xmlns:wne="http://schemas.microsoft.com/office/word/2006/wordml" xmlns:wps="http://schemas.microsoft.com/office/word/2010/wordprocessingShape" mc:Ignorable="w14 w15 w16se w16cid w16 w16cex w16sdtdh w16sdtfl w16du wp14">
   <w:abstractNum w:abstractNumId="0" w15:restartNumberingAfterBreak="0">
-    <w:nsid w:val="45614F31"/>
+    <w:nsid w:val="2654160E"/>
     <w:multiLevelType w:val="hybridMultilevel"/>
-    <w:tmpl w:val="A10CDED0"/>
-    <w:lvl w:ilvl="0" w:tplc="76841364">
+    <w:tmpl w:val="A824F246"/>
+    <w:lvl w:ilvl="0" w:tplc="FC701124">
       <w:start w:val="1"/>
       <w:numFmt w:val="bullet"/>
       <w:lvlText w:val="•"/>
@@ -28150,52 +28374,52 @@
         <w:ind w:left="300" w:hanging="180"/>
       </w:pPr>
     </w:lvl>
-    <w:lvl w:ilvl="1" w:tplc="50B830BA">
+    <w:lvl w:ilvl="1" w:tplc="CDE2039A">
       <w:numFmt w:val="decimal"/>
       <w:lvlText w:val=""/>
       <w:lvlJc w:val="left"/>
     </w:lvl>
-    <w:lvl w:ilvl="2" w:tplc="A3EAE970">
+    <w:lvl w:ilvl="2" w:tplc="8550F464">
       <w:numFmt w:val="decimal"/>
       <w:lvlText w:val=""/>
       <w:lvlJc w:val="left"/>
     </w:lvl>
-    <w:lvl w:ilvl="3" w:tplc="03588F74">
+    <w:lvl w:ilvl="3" w:tplc="37B44E4C">
       <w:numFmt w:val="decimal"/>
       <w:lvlText w:val=""/>
       <w:lvlJc w:val="left"/>
     </w:lvl>
-    <w:lvl w:ilvl="4" w:tplc="BF1C25BA">
+    <w:lvl w:ilvl="4" w:tplc="416E9EB0">
       <w:numFmt w:val="decimal"/>
       <w:lvlText w:val=""/>
       <w:lvlJc w:val="left"/>
     </w:lvl>
-    <w:lvl w:ilvl="5" w:tplc="A62085EC">
+    <w:lvl w:ilvl="5" w:tplc="4B7C4242">
       <w:numFmt w:val="decimal"/>
       <w:lvlText w:val=""/>
       <w:lvlJc w:val="left"/>
     </w:lvl>
-    <w:lvl w:ilvl="6" w:tplc="345ACDFE">
+    <w:lvl w:ilvl="6" w:tplc="4084658C">
       <w:numFmt w:val="decimal"/>
       <w:lvlText w:val=""/>
       <w:lvlJc w:val="left"/>
     </w:lvl>
-    <w:lvl w:ilvl="7" w:tplc="2DE8942A">
+    <w:lvl w:ilvl="7" w:tplc="261696FA">
       <w:numFmt w:val="decimal"/>
       <w:lvlText w:val=""/>
       <w:lvlJc w:val="left"/>
     </w:lvl>
-    <w:lvl w:ilvl="8" w:tplc="80B891C6">
+    <w:lvl w:ilvl="8" w:tplc="61B4B372">
       <w:numFmt w:val="decimal"/>
       <w:lvlText w:val=""/>
       <w:lvlJc w:val="left"/>
     </w:lvl>
   </w:abstractNum>
   <w:abstractNum w:abstractNumId="1" w15:restartNumberingAfterBreak="0">
-    <w:nsid w:val="70431697"/>
+    <w:nsid w:val="5D4E5222"/>
     <w:multiLevelType w:val="hybridMultilevel"/>
-    <w:tmpl w:val="DB48E0F2"/>
-    <w:lvl w:ilvl="0" w:tplc="295C2386">
+    <w:tmpl w:val="4C245E54"/>
+    <w:lvl w:ilvl="0" w:tplc="430453F2">
       <w:start w:val="1"/>
       <w:numFmt w:val="bullet"/>
       <w:lvlText w:val="●"/>
@@ -28204,7 +28428,7 @@
         <w:ind w:left="720" w:hanging="360"/>
       </w:pPr>
     </w:lvl>
-    <w:lvl w:ilvl="1" w:tplc="272E604C">
+    <w:lvl w:ilvl="1" w:tplc="DA76A01C">
       <w:start w:val="1"/>
       <w:numFmt w:val="bullet"/>
       <w:lvlText w:val="○"/>
@@ -28213,7 +28437,7 @@
         <w:ind w:left="1440" w:hanging="360"/>
       </w:pPr>
     </w:lvl>
-    <w:lvl w:ilvl="2" w:tplc="DDA0C540">
+    <w:lvl w:ilvl="2" w:tplc="F460A16E">
       <w:start w:val="1"/>
       <w:numFmt w:val="bullet"/>
       <w:lvlText w:val="■"/>
@@ -28222,7 +28446,7 @@
         <w:ind w:left="2160" w:hanging="360"/>
       </w:pPr>
     </w:lvl>
-    <w:lvl w:ilvl="3" w:tplc="D338CD58">
+    <w:lvl w:ilvl="3" w:tplc="A294B41E">
       <w:start w:val="1"/>
       <w:numFmt w:val="bullet"/>
       <w:lvlText w:val="●"/>
@@ -28231,7 +28455,7 @@
         <w:ind w:left="2880" w:hanging="360"/>
       </w:pPr>
     </w:lvl>
-    <w:lvl w:ilvl="4" w:tplc="42F054CA">
+    <w:lvl w:ilvl="4" w:tplc="5CF8F5E6">
       <w:start w:val="1"/>
       <w:numFmt w:val="bullet"/>
       <w:lvlText w:val="○"/>
@@ -28240,7 +28464,7 @@
         <w:ind w:left="3600" w:hanging="360"/>
       </w:pPr>
     </w:lvl>
-    <w:lvl w:ilvl="5" w:tplc="47AE6DD6">
+    <w:lvl w:ilvl="5" w:tplc="361672D0">
       <w:start w:val="1"/>
       <w:numFmt w:val="bullet"/>
       <w:lvlText w:val="■"/>
@@ -28249,7 +28473,7 @@
         <w:ind w:left="4320" w:hanging="360"/>
       </w:pPr>
     </w:lvl>
-    <w:lvl w:ilvl="6" w:tplc="3B14CCD6">
+    <w:lvl w:ilvl="6" w:tplc="FB7EA2D0">
       <w:start w:val="1"/>
       <w:numFmt w:val="bullet"/>
       <w:lvlText w:val="●"/>
@@ -28258,7 +28482,7 @@
         <w:ind w:left="5040" w:hanging="360"/>
       </w:pPr>
     </w:lvl>
-    <w:lvl w:ilvl="7" w:tplc="E6C01AA2">
+    <w:lvl w:ilvl="7" w:tplc="921011D4">
       <w:start w:val="1"/>
       <w:numFmt w:val="bullet"/>
       <w:lvlText w:val="●"/>
@@ -28267,7 +28491,7 @@
         <w:ind w:left="5760" w:hanging="360"/>
       </w:pPr>
     </w:lvl>
-    <w:lvl w:ilvl="8" w:tplc="1B52A2E6">
+    <w:lvl w:ilvl="8" w:tplc="33DCDF3E">
       <w:start w:val="1"/>
       <w:numFmt w:val="bullet"/>
       <w:lvlText w:val="●"/>
@@ -28277,13 +28501,13 @@
       </w:pPr>
     </w:lvl>
   </w:abstractNum>
-  <w:num w:numId="1" w16cid:durableId="624656102">
+  <w:num w:numId="1" w16cid:durableId="383062536">
     <w:abstractNumId w:val="1"/>
     <w:lvlOverride w:ilvl="0">
       <w:startOverride w:val="1"/>
     </w:lvlOverride>
   </w:num>
-  <w:num w:numId="2" w16cid:durableId="1974940367">
+  <w:num w:numId="2" w16cid:durableId="1962805994">
     <w:abstractNumId w:val="0"/>
     <w:lvlOverride w:ilvl="0">
       <w:startOverride w:val="1"/>

</xml_diff>